<commit_message>
resumen cambiado y posible scripts de guardado de circuito en json
</commit_message>
<xml_diff>
--- a/Cosas que hacer.docx
+++ b/Cosas que hacer.docx
@@ -1,10 +1,15 @@
 
 <file path=word/document.xml><?xml version="1.0" encoding="utf-8"?>
-<w:document xmlns:wpc="http://schemas.microsoft.com/office/word/2010/wordprocessingCanvas" xmlns:cx="http://schemas.microsoft.com/office/drawing/2014/chartex" xmlns:cx1="http://schemas.microsoft.com/office/drawing/2015/9/8/chartex" xmlns:cx2="http://schemas.microsoft.com/office/drawing/2015/10/21/chartex" xmlns:cx3="http://schemas.microsoft.com/office/drawing/2016/5/9/chartex" xmlns:cx4="http://schemas.microsoft.com/office/drawing/2016/5/10/chartex" xmlns:cx5="http://schemas.microsoft.com/office/drawing/2016/5/11/chartex" xmlns:cx6="http://schemas.microsoft.com/office/drawing/2016/5/12/chartex" xmlns:cx7="http://schemas.microsoft.com/office/drawing/2016/5/13/chartex" xmlns:cx8="http://schemas.microsoft.com/office/drawing/2016/5/14/chartex" xmlns:mc="http://schemas.openxmlformats.org/markup-compatibility/2006" xmlns:aink="http://schemas.microsoft.com/office/drawing/2016/ink" xmlns:am3d="http://schemas.microsoft.com/office/drawing/2017/model3d" xmlns:o="urn:schemas-microsoft-com:office:office" xmlns:oel="http://schemas.microsoft.com/office/2019/extlst" xmlns:r="http://schemas.openxmlformats.org/officeDocument/2006/relationships" xmlns:m="http://schemas.openxmlformats.org/officeDocument/2006/math" xmlns:v="urn:schemas-microsoft-com:vml" xmlns:wp14="http://schemas.microsoft.com/office/word/2010/wordprocessingDrawing" xmlns:wp="http://schemas.openxmlformats.org/drawingml/2006/wordprocessingDrawing" xmlns:w10="urn:schemas-microsoft-com:office:word" xmlns:w="http://schemas.openxmlformats.org/wordprocessingml/2006/main" xmlns:w14="http://schemas.microsoft.com/office/word/2010/wordml" xmlns:w15="http://schemas.microsoft.com/office/word/2012/wordml" xmlns:w16cex="http://schemas.microsoft.com/office/word/2018/wordml/cex" xmlns:w16cid="http://schemas.microsoft.com/office/word/2016/wordml/cid" xmlns:w16="http://schemas.microsoft.com/office/word/2018/wordml" xmlns:w16du="http://schemas.microsoft.com/office/word/2023/wordml/word16du" xmlns:w16sdtdh="http://schemas.microsoft.com/office/word/2020/wordml/sdtdatahash" xmlns:w16se="http://schemas.microsoft.com/office/word/2015/wordml/symex" xmlns:wpg="http://schemas.microsoft.com/office/word/2010/wordprocessingGroup" xmlns:wpi="http://schemas.microsoft.com/office/word/2010/wordprocessingInk" xmlns:wne="http://schemas.microsoft.com/office/word/2006/wordml" xmlns:wps="http://schemas.microsoft.com/office/word/2010/wordprocessingShape" mc:Ignorable="w14 w15 w16se w16cid w16 w16cex w16sdtdh w16du wp14">
+<w:document xmlns:wpc="http://schemas.microsoft.com/office/word/2010/wordprocessingCanvas" xmlns:cx="http://schemas.microsoft.com/office/drawing/2014/chartex" xmlns:cx1="http://schemas.microsoft.com/office/drawing/2015/9/8/chartex" xmlns:cx2="http://schemas.microsoft.com/office/drawing/2015/10/21/chartex" xmlns:cx3="http://schemas.microsoft.com/office/drawing/2016/5/9/chartex" xmlns:cx4="http://schemas.microsoft.com/office/drawing/2016/5/10/chartex" xmlns:cx5="http://schemas.microsoft.com/office/drawing/2016/5/11/chartex" xmlns:cx6="http://schemas.microsoft.com/office/drawing/2016/5/12/chartex" xmlns:cx7="http://schemas.microsoft.com/office/drawing/2016/5/13/chartex" xmlns:cx8="http://schemas.microsoft.com/office/drawing/2016/5/14/chartex" xmlns:mc="http://schemas.openxmlformats.org/markup-compatibility/2006" xmlns:aink="http://schemas.microsoft.com/office/drawing/2016/ink" xmlns:am3d="http://schemas.microsoft.com/office/drawing/2017/model3d" xmlns:o="urn:schemas-microsoft-com:office:office" xmlns:oel="http://schemas.microsoft.com/office/2019/extlst" xmlns:r="http://schemas.openxmlformats.org/officeDocument/2006/relationships" xmlns:m="http://schemas.openxmlformats.org/officeDocument/2006/math" xmlns:v="urn:schemas-microsoft-com:vml" xmlns:wp14="http://schemas.microsoft.com/office/word/2010/wordprocessingDrawing" xmlns:wp="http://schemas.openxmlformats.org/drawingml/2006/wordprocessingDrawing" xmlns:w10="urn:schemas-microsoft-com:office:word" xmlns:w="http://schemas.openxmlformats.org/wordprocessingml/2006/main" xmlns:w14="http://schemas.microsoft.com/office/word/2010/wordml" xmlns:w15="http://schemas.microsoft.com/office/word/2012/wordml" xmlns:w16cex="http://schemas.microsoft.com/office/word/2018/wordml/cex" xmlns:w16cid="http://schemas.microsoft.com/office/word/2016/wordml/cid" xmlns:w16="http://schemas.microsoft.com/office/word/2018/wordml" xmlns:w16du="http://schemas.microsoft.com/office/word/2023/wordml/word16du" xmlns:w16sdtdh="http://schemas.microsoft.com/office/word/2020/wordml/sdtdatahash" xmlns:w16sdtfl="http://schemas.microsoft.com/office/word/2024/wordml/sdtformatlock" xmlns:w16se="http://schemas.microsoft.com/office/word/2015/wordml/symex" xmlns:wpg="http://schemas.microsoft.com/office/word/2010/wordprocessingGroup" xmlns:wpi="http://schemas.microsoft.com/office/word/2010/wordprocessingInk" xmlns:wne="http://schemas.microsoft.com/office/word/2006/wordml" xmlns:wps="http://schemas.microsoft.com/office/word/2010/wordprocessingShape" mc:Ignorable="w14 w15 w16se w16cid w16 w16cex w16sdtdh w16sdtfl w16du wp14">
   <w:body>
     <w:p>
-      <w:r>
-        <w:t xml:space="preserve">Titulo </w:t>
+      <w:proofErr w:type="spellStart"/>
+      <w:r>
+        <w:t>Titulo</w:t>
+      </w:r>
+      <w:proofErr w:type="spellEnd"/>
+      <w:r>
+        <w:t xml:space="preserve"> </w:t>
       </w:r>
       <w:r>
         <w:sym w:font="Wingdings" w:char="F0E0"/>
@@ -50,10 +55,23 @@
         <w:t>uego de carreas de coches</w:t>
       </w:r>
       <w:r>
-        <w:t xml:space="preserve"> en unity</w:t>
-      </w:r>
-      <w:r>
-        <w:t xml:space="preserve">, en el que se generaran los circuitos proceduralmente, lo que significa que ningún circuito </w:t>
+        <w:t xml:space="preserve"> en </w:t>
+      </w:r>
+      <w:proofErr w:type="spellStart"/>
+      <w:r>
+        <w:t>unity</w:t>
+      </w:r>
+      <w:proofErr w:type="spellEnd"/>
+      <w:r>
+        <w:t xml:space="preserve">, en el que se generaran los circuitos </w:t>
+      </w:r>
+      <w:proofErr w:type="spellStart"/>
+      <w:r>
+        <w:t>proceduralmente</w:t>
+      </w:r>
+      <w:proofErr w:type="spellEnd"/>
+      <w:r>
+        <w:t xml:space="preserve">, lo que significa que ningún circuito </w:t>
       </w:r>
       <w:r>
         <w:t xml:space="preserve">jugado </w:t>
@@ -80,10 +98,18 @@
         <w:t xml:space="preserve"> con la librería de ML</w:t>
       </w:r>
       <w:r>
-        <w:t>-A</w:t>
-      </w:r>
-      <w:r>
-        <w:t>gents, de manera que son capaces de aprender a recorrer todos los circuitos que se puedan generar</w:t>
+        <w:t>-</w:t>
+      </w:r>
+      <w:proofErr w:type="spellStart"/>
+      <w:r>
+        <w:t>A</w:t>
+      </w:r>
+      <w:r>
+        <w:t>gents</w:t>
+      </w:r>
+      <w:proofErr w:type="spellEnd"/>
+      <w:r>
+        <w:t>, de manera que son capaces de aprender a recorrer todos los circuitos que se puedan generar</w:t>
       </w:r>
       <w:r>
         <w:t xml:space="preserve">. Además, </w:t>
@@ -120,7 +146,7 @@
     <w:p/>
     <w:p>
       <w:r>
-        <w:t xml:space="preserve">Nombre del juego </w:t>
+        <w:t xml:space="preserve">Nuevo resumen </w:t>
       </w:r>
       <w:r>
         <w:sym w:font="Wingdings" w:char="F0E0"/>
@@ -129,38 +155,110 @@
         <w:t xml:space="preserve"> </w:t>
       </w:r>
       <w:r>
-        <w:t>Formula Racing</w:t>
+        <w:t xml:space="preserve">Este trabajo presenta el diseño y desarrollo de un videojuego de carreras de coches en Unity que integra generación procedural de circuitos y técnicas de aprendizaje por refuerzo para la inteligencia artificial. El sistema de generación procedural permite crear pistas de forma automática, garantizando que cada circuito sea diferente y evitando la repetitividad, lo que incrementa la </w:t>
+      </w:r>
+      <w:proofErr w:type="spellStart"/>
+      <w:r>
+        <w:t>rejugabilidad</w:t>
+      </w:r>
+      <w:proofErr w:type="spellEnd"/>
+      <w:r>
+        <w:t xml:space="preserve"> y la sensación de novedad en cada partida.</w:t>
+      </w:r>
+    </w:p>
+    <w:p>
+      <w:r>
+        <w:t>Los vehículos controlados por la inteligencia artificial han sido entrenados mediante la librería ML-</w:t>
+      </w:r>
+      <w:proofErr w:type="spellStart"/>
+      <w:r>
+        <w:t>Agents</w:t>
+      </w:r>
+      <w:proofErr w:type="spellEnd"/>
+      <w:r>
+        <w:t>, utilizando aprendizaje por refuerzo para aprender a recorrer correctamente los circuitos generados dinámicamente. Gracias a este enfoque, los agentes son capaces de adaptarse a configuraciones de pista no vistas previamente, manteniendo un comportamiento competitivo.</w:t>
+      </w:r>
+    </w:p>
+    <w:p>
+      <w:r>
+        <w:t>Además, el videojuego incorpora distintos niveles de dificultad que ajustan el rendimiento de la IA, permitiendo ofrecer una experiencia equilibrada tanto para jugadores principiantes como avanzados. De este modo, se consigue un sistema flexible que combina generación procedural y aprendizaje automático para mejorar la experiencia de juego y fomentar la motivación y el desafío continuo del usuario.</w:t>
       </w:r>
     </w:p>
     <w:p/>
     <w:p/>
-    <w:p>
-      <w:r>
-        <w:t xml:space="preserve">Título </w:t>
+    <w:p/>
+    <w:p>
+      <w:r>
+        <w:t xml:space="preserve">Nombre del juego </w:t>
       </w:r>
       <w:r>
         <w:sym w:font="Wingdings" w:char="F0E0"/>
       </w:r>
       <w:r>
-        <w:t>1linea</w:t>
-      </w:r>
-    </w:p>
-    <w:p>
-      <w:r>
-        <w:t xml:space="preserve">Resumen </w:t>
-      </w:r>
-      <w:r>
-        <w:sym w:font="Wingdings" w:char="F0E0"/>
-      </w:r>
-      <w:r>
-        <w:t xml:space="preserve"> no más de 200 palabras (no especificar de mas en los limites de lo que quiero llegar a conseguir.)</w:t>
+        <w:t xml:space="preserve"> Formula Racing</w:t>
       </w:r>
     </w:p>
     <w:p/>
     <w:p/>
     <w:p>
       <w:r>
-        <w:t>Centrar en la generación procedural. Puen mas importante ahora mismo.</w:t>
+        <w:t xml:space="preserve">Título </w:t>
+      </w:r>
+      <w:r>
+        <w:sym w:font="Wingdings" w:char="F0E0"/>
+      </w:r>
+      <w:r>
+        <w:t>1linea</w:t>
+      </w:r>
+    </w:p>
+    <w:p>
+      <w:r>
+        <w:t xml:space="preserve">Resumen </w:t>
+      </w:r>
+      <w:r>
+        <w:sym w:font="Wingdings" w:char="F0E0"/>
+      </w:r>
+      <w:r>
+        <w:t xml:space="preserve"> no más de 200 palabras (no especificar de </w:t>
+      </w:r>
+      <w:proofErr w:type="spellStart"/>
+      <w:r>
+        <w:t>mas</w:t>
+      </w:r>
+      <w:proofErr w:type="spellEnd"/>
+      <w:r>
+        <w:t xml:space="preserve"> en los </w:t>
+      </w:r>
+      <w:proofErr w:type="spellStart"/>
+      <w:r>
+        <w:t>limites</w:t>
+      </w:r>
+      <w:proofErr w:type="spellEnd"/>
+      <w:r>
+        <w:t xml:space="preserve"> de lo que quiero llegar a conseguir.)</w:t>
+      </w:r>
+    </w:p>
+    <w:p/>
+    <w:p/>
+    <w:p>
+      <w:r>
+        <w:t xml:space="preserve">Centrar en la generación procedural. </w:t>
+      </w:r>
+      <w:proofErr w:type="spellStart"/>
+      <w:r>
+        <w:t>Puen</w:t>
+      </w:r>
+      <w:proofErr w:type="spellEnd"/>
+      <w:r>
+        <w:t xml:space="preserve"> </w:t>
+      </w:r>
+      <w:proofErr w:type="spellStart"/>
+      <w:r>
+        <w:t>mas</w:t>
+      </w:r>
+      <w:proofErr w:type="spellEnd"/>
+      <w:r>
+        <w:t xml:space="preserve"> importante ahora mismo.</w:t>
       </w:r>
     </w:p>
     <w:p>
@@ -170,7 +268,15 @@
     </w:p>
     <w:p>
       <w:r>
-        <w:t>Guardar los circuitos en local, mediante un text o algo similar y poder cargarlos.</w:t>
+        <w:t xml:space="preserve">Guardar los circuitos en local, mediante un </w:t>
+      </w:r>
+      <w:proofErr w:type="spellStart"/>
+      <w:r>
+        <w:t>text</w:t>
+      </w:r>
+      <w:proofErr w:type="spellEnd"/>
+      <w:r>
+        <w:t xml:space="preserve"> o algo similar y poder cargarlos.</w:t>
       </w:r>
     </w:p>
     <w:p>
@@ -180,14 +286,109 @@
     </w:p>
     <w:p>
       <w:r>
-        <w:t>Asignar a una tecla la generación para no tener que iniciar y desactivar el editor de unity.</w:t>
-      </w:r>
-    </w:p>
-    <w:p>
-      <w:r>
-        <w:lastRenderedPageBreak/>
+        <w:t xml:space="preserve">Asignar a una tecla la generación para no tener que iniciar y desactivar el editor de </w:t>
+      </w:r>
+      <w:proofErr w:type="spellStart"/>
+      <w:r>
+        <w:t>unity</w:t>
+      </w:r>
+      <w:proofErr w:type="spellEnd"/>
+      <w:r>
+        <w:t>.</w:t>
+      </w:r>
+    </w:p>
+    <w:p>
+      <w:r>
         <w:t>Asignar tecla para guardado y cargar de circuitos.</w:t>
       </w:r>
+    </w:p>
+    <w:p/>
+    <w:p>
+      <w:pPr>
+        <w:rPr>
+          <w:b/>
+          <w:bCs/>
+        </w:rPr>
+      </w:pPr>
+      <w:r>
+        <w:rPr>
+          <w:b/>
+          <w:bCs/>
+        </w:rPr>
+        <w:t>Urgentes</w:t>
+      </w:r>
+    </w:p>
+    <w:p>
+      <w:r>
+        <w:t xml:space="preserve">Cambiar resumen pasar al chat para que los escriba como un </w:t>
+      </w:r>
+      <w:proofErr w:type="spellStart"/>
+      <w:r>
+        <w:t>abstract</w:t>
+      </w:r>
+      <w:proofErr w:type="spellEnd"/>
+      <w:r>
+        <w:t xml:space="preserve"> de un </w:t>
+      </w:r>
+      <w:proofErr w:type="spellStart"/>
+      <w:proofErr w:type="gramStart"/>
+      <w:r>
+        <w:t>paper</w:t>
+      </w:r>
+      <w:proofErr w:type="spellEnd"/>
+      <w:proofErr w:type="gramEnd"/>
+      <w:r>
+        <w:t xml:space="preserve"> científico</w:t>
+      </w:r>
+    </w:p>
+    <w:p/>
+    <w:p>
+      <w:r>
+        <w:t xml:space="preserve">20 circuitos con </w:t>
+      </w:r>
+      <w:proofErr w:type="spellStart"/>
+      <w:r>
+        <w:t>colliders</w:t>
+      </w:r>
+      <w:proofErr w:type="spellEnd"/>
+      <w:r>
+        <w:t xml:space="preserve"> y </w:t>
+      </w:r>
+      <w:proofErr w:type="spellStart"/>
+      <w:r>
+        <w:t>checkpoints</w:t>
+      </w:r>
+      <w:proofErr w:type="spellEnd"/>
+      <w:r>
+        <w:t xml:space="preserve"> en </w:t>
+      </w:r>
+      <w:proofErr w:type="spellStart"/>
+      <w:r>
+        <w:t>txt</w:t>
+      </w:r>
+      <w:proofErr w:type="spellEnd"/>
+      <w:r>
+        <w:t xml:space="preserve">, aleatoriamente 1 en </w:t>
+      </w:r>
+      <w:proofErr w:type="spellStart"/>
+      <w:r>
+        <w:t>unity</w:t>
+      </w:r>
+      <w:proofErr w:type="spellEnd"/>
+      <w:r>
+        <w:t>. Y lanzar coche en el circuito.</w:t>
+      </w:r>
+    </w:p>
+    <w:p/>
+    <w:p>
+      <w:r>
+        <w:t xml:space="preserve">Mandar email de lo que he hecho y pedir </w:t>
+      </w:r>
+      <w:proofErr w:type="spellStart"/>
+      <w:r>
+        <w:t>reunion</w:t>
+      </w:r>
+      <w:proofErr w:type="spellEnd"/>
     </w:p>
     <w:sectPr>
       <w:pgSz w:w="11906" w:h="16838"/>
@@ -200,7 +401,7 @@
 </file>
 
 <file path=word/styles.xml><?xml version="1.0" encoding="utf-8"?>
-<w:styles xmlns:mc="http://schemas.openxmlformats.org/markup-compatibility/2006" xmlns:r="http://schemas.openxmlformats.org/officeDocument/2006/relationships" xmlns:w="http://schemas.openxmlformats.org/wordprocessingml/2006/main" xmlns:w14="http://schemas.microsoft.com/office/word/2010/wordml" xmlns:w15="http://schemas.microsoft.com/office/word/2012/wordml" xmlns:w16cex="http://schemas.microsoft.com/office/word/2018/wordml/cex" xmlns:w16cid="http://schemas.microsoft.com/office/word/2016/wordml/cid" xmlns:w16="http://schemas.microsoft.com/office/word/2018/wordml" xmlns:w16du="http://schemas.microsoft.com/office/word/2023/wordml/word16du" xmlns:w16sdtdh="http://schemas.microsoft.com/office/word/2020/wordml/sdtdatahash" xmlns:w16se="http://schemas.microsoft.com/office/word/2015/wordml/symex" mc:Ignorable="w14 w15 w16se w16cid w16 w16cex w16sdtdh w16du">
+<w:styles xmlns:mc="http://schemas.openxmlformats.org/markup-compatibility/2006" xmlns:r="http://schemas.openxmlformats.org/officeDocument/2006/relationships" xmlns:w="http://schemas.openxmlformats.org/wordprocessingml/2006/main" xmlns:w14="http://schemas.microsoft.com/office/word/2010/wordml" xmlns:w15="http://schemas.microsoft.com/office/word/2012/wordml" xmlns:w16cex="http://schemas.microsoft.com/office/word/2018/wordml/cex" xmlns:w16cid="http://schemas.microsoft.com/office/word/2016/wordml/cid" xmlns:w16="http://schemas.microsoft.com/office/word/2018/wordml" xmlns:w16du="http://schemas.microsoft.com/office/word/2023/wordml/word16du" xmlns:w16sdtdh="http://schemas.microsoft.com/office/word/2020/wordml/sdtdatahash" xmlns:w16sdtfl="http://schemas.microsoft.com/office/word/2024/wordml/sdtformatlock" xmlns:w16se="http://schemas.microsoft.com/office/word/2015/wordml/symex" mc:Ignorable="w14 w15 w16se w16cid w16 w16cex w16sdtdh w16sdtfl w16du">
   <w:docDefaults>
     <w:rPrDefault>
       <w:rPr>
@@ -1115,6 +1316,17 @@
       <w:spacing w:val="5"/>
     </w:rPr>
   </w:style>
+  <w:style w:type="paragraph" w:styleId="NormalWeb">
+    <w:name w:val="Normal (Web)"/>
+    <w:basedOn w:val="Normal"/>
+    <w:uiPriority w:val="99"/>
+    <w:semiHidden/>
+    <w:unhideWhenUsed/>
+    <w:rsid w:val="009C03DA"/>
+    <w:rPr>
+      <w:rFonts w:ascii="Times New Roman" w:hAnsi="Times New Roman" w:cs="Times New Roman"/>
+    </w:rPr>
+  </w:style>
 </w:styles>
 </file>
 

</xml_diff>

<commit_message>
nuevos circuitos, y empieze de escena de inicio
</commit_message>
<xml_diff>
--- a/Cosas que hacer.docx
+++ b/Cosas que hacer.docx
@@ -3,8 +3,13 @@
 <w:document xmlns:wpc="http://schemas.microsoft.com/office/word/2010/wordprocessingCanvas" xmlns:cx="http://schemas.microsoft.com/office/drawing/2014/chartex" xmlns:cx1="http://schemas.microsoft.com/office/drawing/2015/9/8/chartex" xmlns:cx2="http://schemas.microsoft.com/office/drawing/2015/10/21/chartex" xmlns:cx3="http://schemas.microsoft.com/office/drawing/2016/5/9/chartex" xmlns:cx4="http://schemas.microsoft.com/office/drawing/2016/5/10/chartex" xmlns:cx5="http://schemas.microsoft.com/office/drawing/2016/5/11/chartex" xmlns:cx6="http://schemas.microsoft.com/office/drawing/2016/5/12/chartex" xmlns:cx7="http://schemas.microsoft.com/office/drawing/2016/5/13/chartex" xmlns:cx8="http://schemas.microsoft.com/office/drawing/2016/5/14/chartex" xmlns:mc="http://schemas.openxmlformats.org/markup-compatibility/2006" xmlns:aink="http://schemas.microsoft.com/office/drawing/2016/ink" xmlns:am3d="http://schemas.microsoft.com/office/drawing/2017/model3d" xmlns:o="urn:schemas-microsoft-com:office:office" xmlns:oel="http://schemas.microsoft.com/office/2019/extlst" xmlns:r="http://schemas.openxmlformats.org/officeDocument/2006/relationships" xmlns:m="http://schemas.openxmlformats.org/officeDocument/2006/math" xmlns:v="urn:schemas-microsoft-com:vml" xmlns:wp14="http://schemas.microsoft.com/office/word/2010/wordprocessingDrawing" xmlns:wp="http://schemas.openxmlformats.org/drawingml/2006/wordprocessingDrawing" xmlns:w10="urn:schemas-microsoft-com:office:word" xmlns:w="http://schemas.openxmlformats.org/wordprocessingml/2006/main" xmlns:w14="http://schemas.microsoft.com/office/word/2010/wordml" xmlns:w15="http://schemas.microsoft.com/office/word/2012/wordml" xmlns:w16cex="http://schemas.microsoft.com/office/word/2018/wordml/cex" xmlns:w16cid="http://schemas.microsoft.com/office/word/2016/wordml/cid" xmlns:w16="http://schemas.microsoft.com/office/word/2018/wordml" xmlns:w16du="http://schemas.microsoft.com/office/word/2023/wordml/word16du" xmlns:w16sdtdh="http://schemas.microsoft.com/office/word/2020/wordml/sdtdatahash" xmlns:w16se="http://schemas.microsoft.com/office/word/2015/wordml/symex" xmlns:wpg="http://schemas.microsoft.com/office/word/2010/wordprocessingGroup" xmlns:wpi="http://schemas.microsoft.com/office/word/2010/wordprocessingInk" xmlns:wne="http://schemas.microsoft.com/office/word/2006/wordml" xmlns:wps="http://schemas.microsoft.com/office/word/2010/wordprocessingShape" mc:Ignorable="w14 w15 w16se w16cid w16 w16cex w16sdtdh w16du wp14">
   <w:body>
     <w:p>
-      <w:r>
-        <w:t xml:space="preserve">Titulo </w:t>
+      <w:proofErr w:type="spellStart"/>
+      <w:r>
+        <w:t>Titulo</w:t>
+      </w:r>
+      <w:proofErr w:type="spellEnd"/>
+      <w:r>
+        <w:t xml:space="preserve"> </w:t>
       </w:r>
       <w:r>
         <w:sym w:font="Wingdings" w:char="F0E0"/>
@@ -50,10 +55,23 @@
         <w:t>uego de carreas de coches</w:t>
       </w:r>
       <w:r>
-        <w:t xml:space="preserve"> en unity</w:t>
-      </w:r>
-      <w:r>
-        <w:t xml:space="preserve">, en el que se generaran los circuitos proceduralmente, lo que significa que ningún circuito </w:t>
+        <w:t xml:space="preserve"> en </w:t>
+      </w:r>
+      <w:proofErr w:type="spellStart"/>
+      <w:r>
+        <w:t>unity</w:t>
+      </w:r>
+      <w:proofErr w:type="spellEnd"/>
+      <w:r>
+        <w:t xml:space="preserve">, en el que se generaran los circuitos </w:t>
+      </w:r>
+      <w:proofErr w:type="spellStart"/>
+      <w:r>
+        <w:t>proceduralmente</w:t>
+      </w:r>
+      <w:proofErr w:type="spellEnd"/>
+      <w:r>
+        <w:t xml:space="preserve">, lo que significa que ningún circuito </w:t>
       </w:r>
       <w:r>
         <w:t xml:space="preserve">jugado </w:t>
@@ -80,10 +98,18 @@
         <w:t xml:space="preserve"> con la librería de ML</w:t>
       </w:r>
       <w:r>
-        <w:t>-A</w:t>
-      </w:r>
-      <w:r>
-        <w:t>gents, de manera que son capaces de aprender a recorrer todos los circuitos que se puedan generar</w:t>
+        <w:t>-</w:t>
+      </w:r>
+      <w:proofErr w:type="spellStart"/>
+      <w:r>
+        <w:t>A</w:t>
+      </w:r>
+      <w:r>
+        <w:t>gents</w:t>
+      </w:r>
+      <w:proofErr w:type="spellEnd"/>
+      <w:r>
+        <w:t>, de manera que son capaces de aprender a recorrer todos los circuitos que se puedan generar</w:t>
       </w:r>
       <w:r>
         <w:t xml:space="preserve">. Además, </w:t>
@@ -129,12 +155,28 @@
         <w:t xml:space="preserve"> </w:t>
       </w:r>
       <w:r>
-        <w:t>Este trabajo presenta el diseño y desarrollo de un videojuego de carreras de coches en Unity que integra generación procedural de circuitos y técnicas de aprendizaje por refuerzo para la inteligencia artificial. El sistema de generación procedural permite crear pistas de forma automática, garantizando que cada circuito sea diferente y evitando la repetitividad, lo que incrementa la rejugabilidad y la sensación de novedad en cada partida.</w:t>
+        <w:t xml:space="preserve">Este trabajo presenta el diseño y desarrollo de un videojuego de carreras de coches en Unity que integra generación procedural de circuitos y técnicas de aprendizaje por refuerzo para la inteligencia artificial. El sistema de generación procedural permite crear pistas de forma automática, garantizando que cada circuito sea diferente y evitando la repetitividad, lo que incrementa la </w:t>
+      </w:r>
+      <w:proofErr w:type="spellStart"/>
+      <w:r>
+        <w:t>rejugabilidad</w:t>
+      </w:r>
+      <w:proofErr w:type="spellEnd"/>
+      <w:r>
+        <w:t xml:space="preserve"> y la sensación de novedad en cada partida.</w:t>
       </w:r>
     </w:p>
     <w:p>
       <w:r>
-        <w:t>Los vehículos controlados por la inteligencia artificial han sido entrenados mediante la librería ML-Agents, utilizando aprendizaje por refuerzo para aprender a recorrer correctamente los circuitos generados dinámicamente. Gracias a este enfoque, los agentes son capaces de adaptarse a configuraciones de pista no vistas previamente, manteniendo un comportamiento competitivo.</w:t>
+        <w:t>Los vehículos controlados por la inteligencia artificial han sido entrenados mediante la librería ML-</w:t>
+      </w:r>
+      <w:proofErr w:type="spellStart"/>
+      <w:r>
+        <w:t>Agents</w:t>
+      </w:r>
+      <w:proofErr w:type="spellEnd"/>
+      <w:r>
+        <w:t>, utilizando aprendizaje por refuerzo para aprender a recorrer correctamente los circuitos generados dinámicamente. Gracias a este enfoque, los agentes son capaces de adaptarse a configuraciones de pista no vistas previamente, manteniendo un comportamiento competitivo.</w:t>
       </w:r>
     </w:p>
     <w:p>
@@ -153,13 +195,25 @@
         <w:sym w:font="Wingdings" w:char="F0E0"/>
       </w:r>
       <w:r>
-        <w:t xml:space="preserve"> Formula Racing</w:t>
-      </w:r>
+        <w:t xml:space="preserve"> </w:t>
+      </w:r>
+      <w:proofErr w:type="spellStart"/>
+      <w:r>
+        <w:t>Race</w:t>
+      </w:r>
+      <w:proofErr w:type="spellEnd"/>
+      <w:r>
+        <w:t xml:space="preserve"> </w:t>
+      </w:r>
+      <w:proofErr w:type="spellStart"/>
+      <w:r>
+        <w:t>Infinity</w:t>
+      </w:r>
+      <w:proofErr w:type="spellEnd"/>
     </w:p>
     <w:p/>
     <w:p/>
     <w:p/>
-    <w:p/>
     <w:p>
       <w:r>
         <w:t>Optimizar el generador para que sea capaz de conseguir resultados buenos en menos tiempo.</w:t>
@@ -167,7 +221,23 @@
     </w:p>
     <w:p>
       <w:r>
-        <w:t>Revisar los valores de velocidad máxima, aceleración… del car controller para optimizarlos de la ejor manera para el agente</w:t>
+        <w:t xml:space="preserve">Revisar los valores de velocidad máxima, aceleración… del car </w:t>
+      </w:r>
+      <w:proofErr w:type="spellStart"/>
+      <w:r>
+        <w:t>controller</w:t>
+      </w:r>
+      <w:proofErr w:type="spellEnd"/>
+      <w:r>
+        <w:t xml:space="preserve"> para optimizarlos de la </w:t>
+      </w:r>
+      <w:proofErr w:type="spellStart"/>
+      <w:r>
+        <w:t>ejor</w:t>
+      </w:r>
+      <w:proofErr w:type="spellEnd"/>
+      <w:r>
+        <w:t xml:space="preserve"> manera para el agente</w:t>
       </w:r>
     </w:p>
     <w:p/>
@@ -188,9 +258,45 @@
     </w:p>
     <w:p>
       <w:r>
-        <w:t>20 circuitos con colliders y checkpoints en txt, aleatoriamente 1 en unity. Y lanzar coche en el circuito.</w:t>
+        <w:t xml:space="preserve">20 circuitos con </w:t>
+      </w:r>
+      <w:proofErr w:type="spellStart"/>
+      <w:r>
+        <w:t>colliders</w:t>
+      </w:r>
+      <w:proofErr w:type="spellEnd"/>
+      <w:r>
+        <w:t xml:space="preserve"> y </w:t>
+      </w:r>
+      <w:proofErr w:type="spellStart"/>
+      <w:r>
+        <w:t>checkpoints</w:t>
+      </w:r>
+      <w:proofErr w:type="spellEnd"/>
+      <w:r>
+        <w:t xml:space="preserve"> en </w:t>
+      </w:r>
+      <w:proofErr w:type="spellStart"/>
+      <w:r>
+        <w:t>txt</w:t>
+      </w:r>
+      <w:proofErr w:type="spellEnd"/>
+      <w:r>
+        <w:t xml:space="preserve">, aleatoriamente 1 en </w:t>
+      </w:r>
+      <w:proofErr w:type="spellStart"/>
+      <w:r>
+        <w:t>unity</w:t>
+      </w:r>
+      <w:proofErr w:type="spellEnd"/>
+      <w:r>
+        <w:t>. Y lanzar coche en el circuito.</w:t>
       </w:r>
     </w:p>
+    <w:p/>
+    <w:p/>
+    <w:p/>
+    <w:p/>
     <w:sectPr>
       <w:pgSz w:w="11906" w:h="16838"/>
       <w:pgMar w:top="1417" w:right="1701" w:bottom="1417" w:left="1701" w:header="708" w:footer="708" w:gutter="0"/>
@@ -804,7 +910,6 @@
   <w:style w:type="character" w:default="1" w:styleId="Fuentedeprrafopredeter">
     <w:name w:val="Default Paragraph Font"/>
     <w:uiPriority w:val="1"/>
-    <w:semiHidden/>
     <w:unhideWhenUsed/>
   </w:style>
   <w:style w:type="table" w:default="1" w:styleId="Tablanormal">

</xml_diff>

<commit_message>
solucion de raycast, y inicio de implementacion de sistema de entrenamiento, con algun fallo
</commit_message>
<xml_diff>
--- a/Cosas que hacer.docx
+++ b/Cosas que hacer.docx
@@ -258,39 +258,36 @@
     </w:p>
     <w:p>
       <w:r>
-        <w:t xml:space="preserve">20 circuitos con </w:t>
+        <w:t>Solucionar el problema de las vueltas del primer circuito.</w:t>
+      </w:r>
+    </w:p>
+    <w:p>
+      <w:r>
+        <w:t xml:space="preserve">ahora ya </w:t>
       </w:r>
       <w:proofErr w:type="spellStart"/>
       <w:r>
-        <w:t>colliders</w:t>
+        <w:t>esta</w:t>
       </w:r>
       <w:proofErr w:type="spellEnd"/>
       <w:r>
-        <w:t xml:space="preserve"> y </w:t>
+        <w:t xml:space="preserve"> el problema de </w:t>
       </w:r>
       <w:proofErr w:type="spellStart"/>
       <w:r>
-        <w:t>checkpoints</w:t>
+        <w:t>proximos</w:t>
       </w:r>
       <w:proofErr w:type="spellEnd"/>
       <w:r>
-        <w:t xml:space="preserve"> en </w:t>
+        <w:t xml:space="preserve"> circuitos solucionados, ya se actualiza, pero para solucionar eso, se </w:t>
       </w:r>
       <w:proofErr w:type="spellStart"/>
       <w:r>
-        <w:t>txt</w:t>
+        <w:t>a</w:t>
       </w:r>
       <w:proofErr w:type="spellEnd"/>
       <w:r>
-        <w:t xml:space="preserve">, aleatoriamente 1 en </w:t>
-      </w:r>
-      <w:proofErr w:type="spellStart"/>
-      <w:r>
-        <w:t>unity</w:t>
-      </w:r>
-      <w:proofErr w:type="spellEnd"/>
-      <w:r>
-        <w:t>. Y lanzar coche en el circuito.</w:t>
+        <w:t xml:space="preserve"> fastidiado el del primer circuito ya que ahora aparece vueltas 1/0 y cuando se completa 1 vuelta se resetea el episodio creo. como lo soluciono ?</w:t>
       </w:r>
     </w:p>
     <w:p/>

</xml_diff>

<commit_message>
cambios para intento de funcionamiento de entrenamiento
</commit_message>
<xml_diff>
--- a/Cosas que hacer.docx
+++ b/Cosas que hacer.docx
@@ -3,38 +3,124 @@
 <w:document xmlns:wpc="http://schemas.microsoft.com/office/word/2010/wordprocessingCanvas" xmlns:cx="http://schemas.microsoft.com/office/drawing/2014/chartex" xmlns:cx1="http://schemas.microsoft.com/office/drawing/2015/9/8/chartex" xmlns:cx2="http://schemas.microsoft.com/office/drawing/2015/10/21/chartex" xmlns:cx3="http://schemas.microsoft.com/office/drawing/2016/5/9/chartex" xmlns:cx4="http://schemas.microsoft.com/office/drawing/2016/5/10/chartex" xmlns:cx5="http://schemas.microsoft.com/office/drawing/2016/5/11/chartex" xmlns:cx6="http://schemas.microsoft.com/office/drawing/2016/5/12/chartex" xmlns:cx7="http://schemas.microsoft.com/office/drawing/2016/5/13/chartex" xmlns:cx8="http://schemas.microsoft.com/office/drawing/2016/5/14/chartex" xmlns:mc="http://schemas.openxmlformats.org/markup-compatibility/2006" xmlns:aink="http://schemas.microsoft.com/office/drawing/2016/ink" xmlns:am3d="http://schemas.microsoft.com/office/drawing/2017/model3d" xmlns:o="urn:schemas-microsoft-com:office:office" xmlns:oel="http://schemas.microsoft.com/office/2019/extlst" xmlns:r="http://schemas.openxmlformats.org/officeDocument/2006/relationships" xmlns:m="http://schemas.openxmlformats.org/officeDocument/2006/math" xmlns:v="urn:schemas-microsoft-com:vml" xmlns:wp14="http://schemas.microsoft.com/office/word/2010/wordprocessingDrawing" xmlns:wp="http://schemas.openxmlformats.org/drawingml/2006/wordprocessingDrawing" xmlns:w10="urn:schemas-microsoft-com:office:word" xmlns:w="http://schemas.openxmlformats.org/wordprocessingml/2006/main" xmlns:w14="http://schemas.microsoft.com/office/word/2010/wordml" xmlns:w15="http://schemas.microsoft.com/office/word/2012/wordml" xmlns:w16cex="http://schemas.microsoft.com/office/word/2018/wordml/cex" xmlns:w16cid="http://schemas.microsoft.com/office/word/2016/wordml/cid" xmlns:w16="http://schemas.microsoft.com/office/word/2018/wordml" xmlns:w16du="http://schemas.microsoft.com/office/word/2023/wordml/word16du" xmlns:w16sdtdh="http://schemas.microsoft.com/office/word/2020/wordml/sdtdatahash" xmlns:w16se="http://schemas.microsoft.com/office/word/2015/wordml/symex" xmlns:wpg="http://schemas.microsoft.com/office/word/2010/wordprocessingGroup" xmlns:wpi="http://schemas.microsoft.com/office/word/2010/wordprocessingInk" xmlns:wne="http://schemas.microsoft.com/office/word/2006/wordml" xmlns:wps="http://schemas.microsoft.com/office/word/2010/wordprocessingShape" mc:Ignorable="w14 w15 w16se w16cid w16 w16cex w16sdtdh w16du wp14">
   <w:body>
     <w:p>
-      <w:proofErr w:type="spellStart"/>
-      <w:r>
-        <w:t>Titulo</w:t>
-      </w:r>
-      <w:proofErr w:type="spellEnd"/>
+      <w:r>
+        <w:t xml:space="preserve">Titulo </w:t>
+      </w:r>
+      <w:r>
+        <w:sym w:font="Wingdings" w:char="F0E0"/>
+      </w:r>
       <w:r>
         <w:t xml:space="preserve"> </w:t>
       </w:r>
       <w:r>
+        <w:t>Diseño y desarrollo de un videojuego de carreras con generación proce</w:t>
+      </w:r>
+      <w:r>
+        <w:t>dural</w:t>
+      </w:r>
+      <w:r>
+        <w:t xml:space="preserve"> de circuitos y entrenamiento de inteligencia artificial mediante aprendizaje </w:t>
+      </w:r>
+      <w:r>
+        <w:t>por refuerzo</w:t>
+      </w:r>
+    </w:p>
+    <w:p/>
+    <w:p/>
+    <w:p>
+      <w:r>
+        <w:t xml:space="preserve">Resumen </w:t>
+      </w:r>
+      <w:r>
         <w:sym w:font="Wingdings" w:char="F0E0"/>
       </w:r>
       <w:r>
         <w:t xml:space="preserve"> </w:t>
       </w:r>
       <w:r>
-        <w:t>Diseño y desarrollo de un videojuego de carreras con generación proce</w:t>
-      </w:r>
-      <w:r>
-        <w:t>dural</w:t>
-      </w:r>
-      <w:r>
-        <w:t xml:space="preserve"> de circuitos y entrenamiento de inteligencia artificial mediante aprendizaje </w:t>
-      </w:r>
-      <w:r>
-        <w:t>por refuerzo</w:t>
+        <w:t xml:space="preserve">Diseño y desarrollo de un </w:t>
+      </w:r>
+      <w:r>
+        <w:t>video</w:t>
+      </w:r>
+      <w:r>
+        <w:t>j</w:t>
+      </w:r>
+      <w:r>
+        <w:t>uego de carreas de coches</w:t>
+      </w:r>
+      <w:r>
+        <w:t xml:space="preserve"> en unity</w:t>
+      </w:r>
+      <w:r>
+        <w:t xml:space="preserve">, en el que se generaran los circuitos proceduralmente, lo que significa que ningún circuito </w:t>
+      </w:r>
+      <w:r>
+        <w:t xml:space="preserve">jugado </w:t>
+      </w:r>
+      <w:r>
+        <w:t>anterior</w:t>
+      </w:r>
+      <w:r>
+        <w:t>mente</w:t>
+      </w:r>
+      <w:r>
+        <w:t xml:space="preserve"> será igual al siguiente</w:t>
+      </w:r>
+      <w:r>
+        <w:t>,</w:t>
+      </w:r>
+      <w:r>
+        <w:t xml:space="preserve"> generando una sensación de juego inigualable y en la que no sientas que es todo muy repetitivo. Por otro lado, los coches contra los que se compite son entrenados mediante </w:t>
+      </w:r>
+      <w:r>
+        <w:t>aprendizaje por refuerzo</w:t>
+      </w:r>
+      <w:r>
+        <w:t xml:space="preserve"> con la librería de ML</w:t>
+      </w:r>
+      <w:r>
+        <w:t>-A</w:t>
+      </w:r>
+      <w:r>
+        <w:t>gents, de manera que son capaces de aprender a recorrer todos los circuitos que se puedan generar</w:t>
+      </w:r>
+      <w:r>
+        <w:t xml:space="preserve">. Además, </w:t>
+      </w:r>
+      <w:r>
+        <w:t>se podrá elegir el nivel de dificultad que tiene la IA, de manera que si no eres muy habilidoso podrá elegir un nivel de dificultad me</w:t>
+      </w:r>
+      <w:r>
+        <w:t>n</w:t>
+      </w:r>
+      <w:r>
+        <w:t>or</w:t>
+      </w:r>
+      <w:r>
+        <w:t>,</w:t>
+      </w:r>
+      <w:r>
+        <w:t xml:space="preserve"> lo</w:t>
+      </w:r>
+      <w:r>
+        <w:t xml:space="preserve"> que</w:t>
+      </w:r>
+      <w:r>
+        <w:t xml:space="preserve"> realizara que la IA se</w:t>
+      </w:r>
+      <w:r>
+        <w:t>a</w:t>
+      </w:r>
+      <w:r>
+        <w:t xml:space="preserve"> peor y por tanto tengas una mejor experiencia de juego, y en caso de que tu nivel sea alto puedas aumentar el nivel de la IA, para que no sientas que es un juego muy fácil.</w:t>
       </w:r>
     </w:p>
     <w:p/>
     <w:p/>
     <w:p>
       <w:r>
-        <w:t xml:space="preserve">Resumen </w:t>
+        <w:t xml:space="preserve">Nuevo resumen </w:t>
       </w:r>
       <w:r>
         <w:sym w:font="Wingdings" w:char="F0E0"/>
@@ -43,140 +129,12 @@
         <w:t xml:space="preserve"> </w:t>
       </w:r>
       <w:r>
-        <w:t xml:space="preserve">Diseño y desarrollo de un </w:t>
-      </w:r>
-      <w:r>
-        <w:t>video</w:t>
-      </w:r>
-      <w:r>
-        <w:t>j</w:t>
-      </w:r>
-      <w:r>
-        <w:t>uego de carreas de coches</w:t>
-      </w:r>
-      <w:r>
-        <w:t xml:space="preserve"> en </w:t>
-      </w:r>
-      <w:proofErr w:type="spellStart"/>
-      <w:r>
-        <w:t>unity</w:t>
-      </w:r>
-      <w:proofErr w:type="spellEnd"/>
-      <w:r>
-        <w:t xml:space="preserve">, en el que se generaran los circuitos </w:t>
-      </w:r>
-      <w:proofErr w:type="spellStart"/>
-      <w:r>
-        <w:t>proceduralmente</w:t>
-      </w:r>
-      <w:proofErr w:type="spellEnd"/>
-      <w:r>
-        <w:t xml:space="preserve">, lo que significa que ningún circuito </w:t>
-      </w:r>
-      <w:r>
-        <w:t xml:space="preserve">jugado </w:t>
-      </w:r>
-      <w:r>
-        <w:t>anterior</w:t>
-      </w:r>
-      <w:r>
-        <w:t>mente</w:t>
-      </w:r>
-      <w:r>
-        <w:t xml:space="preserve"> será igual al siguiente</w:t>
-      </w:r>
-      <w:r>
-        <w:t>,</w:t>
-      </w:r>
-      <w:r>
-        <w:t xml:space="preserve"> generando una sensación de juego inigualable y en la que no sientas que es todo muy repetitivo. Por otro lado, los coches contra los que se compite son entrenados mediante </w:t>
-      </w:r>
-      <w:r>
-        <w:t>aprendizaje por refuerzo</w:t>
-      </w:r>
-      <w:r>
-        <w:t xml:space="preserve"> con la librería de ML</w:t>
-      </w:r>
-      <w:r>
-        <w:t>-</w:t>
-      </w:r>
-      <w:proofErr w:type="spellStart"/>
-      <w:r>
-        <w:t>A</w:t>
-      </w:r>
-      <w:r>
-        <w:t>gents</w:t>
-      </w:r>
-      <w:proofErr w:type="spellEnd"/>
-      <w:r>
-        <w:t>, de manera que son capaces de aprender a recorrer todos los circuitos que se puedan generar</w:t>
-      </w:r>
-      <w:r>
-        <w:t xml:space="preserve">. Además, </w:t>
-      </w:r>
-      <w:r>
-        <w:t>se podrá elegir el nivel de dificultad que tiene la IA, de manera que si no eres muy habilidoso podrá elegir un nivel de dificultad me</w:t>
-      </w:r>
-      <w:r>
-        <w:t>n</w:t>
-      </w:r>
-      <w:r>
-        <w:t>or</w:t>
-      </w:r>
-      <w:r>
-        <w:t>,</w:t>
-      </w:r>
-      <w:r>
-        <w:t xml:space="preserve"> lo</w:t>
-      </w:r>
-      <w:r>
-        <w:t xml:space="preserve"> que</w:t>
-      </w:r>
-      <w:r>
-        <w:t xml:space="preserve"> realizara que la IA se</w:t>
-      </w:r>
-      <w:r>
-        <w:t>a</w:t>
-      </w:r>
-      <w:r>
-        <w:t xml:space="preserve"> peor y por tanto tengas una mejor experiencia de juego, y en caso de que tu nivel sea alto puedas aumentar el nivel de la IA, para que no sientas que es un juego muy fácil.</w:t>
-      </w:r>
-    </w:p>
-    <w:p/>
-    <w:p/>
-    <w:p>
-      <w:r>
-        <w:t xml:space="preserve">Nuevo resumen </w:t>
-      </w:r>
-      <w:r>
-        <w:sym w:font="Wingdings" w:char="F0E0"/>
-      </w:r>
-      <w:r>
-        <w:t xml:space="preserve"> </w:t>
-      </w:r>
-      <w:r>
-        <w:t xml:space="preserve">Este trabajo presenta el diseño y desarrollo de un videojuego de carreras de coches en Unity que integra generación procedural de circuitos y técnicas de aprendizaje por refuerzo para la inteligencia artificial. El sistema de generación procedural permite crear pistas de forma automática, garantizando que cada circuito sea diferente y evitando la repetitividad, lo que incrementa la </w:t>
-      </w:r>
-      <w:proofErr w:type="spellStart"/>
-      <w:r>
-        <w:t>rejugabilidad</w:t>
-      </w:r>
-      <w:proofErr w:type="spellEnd"/>
-      <w:r>
-        <w:t xml:space="preserve"> y la sensación de novedad en cada partida.</w:t>
+        <w:t>Este trabajo presenta el diseño y desarrollo de un videojuego de carreras de coches en Unity que integra generación procedural de circuitos y técnicas de aprendizaje por refuerzo para la inteligencia artificial. El sistema de generación procedural permite crear pistas de forma automática, garantizando que cada circuito sea diferente y evitando la repetitividad, lo que incrementa la rejugabilidad y la sensación de novedad en cada partida.</w:t>
       </w:r>
     </w:p>
     <w:p>
       <w:r>
-        <w:t>Los vehículos controlados por la inteligencia artificial han sido entrenados mediante la librería ML-</w:t>
-      </w:r>
-      <w:proofErr w:type="spellStart"/>
-      <w:r>
-        <w:t>Agents</w:t>
-      </w:r>
-      <w:proofErr w:type="spellEnd"/>
-      <w:r>
-        <w:t>, utilizando aprendizaje por refuerzo para aprender a recorrer correctamente los circuitos generados dinámicamente. Gracias a este enfoque, los agentes son capaces de adaptarse a configuraciones de pista no vistas previamente, manteniendo un comportamiento competitivo.</w:t>
+        <w:t>Los vehículos controlados por la inteligencia artificial han sido entrenados mediante la librería ML-Agents, utilizando aprendizaje por refuerzo para aprender a recorrer correctamente los circuitos generados dinámicamente. Gracias a este enfoque, los agentes son capaces de adaptarse a configuraciones de pista no vistas previamente, manteniendo un comportamiento competitivo.</w:t>
       </w:r>
     </w:p>
     <w:p>
@@ -197,19 +155,9 @@
       <w:r>
         <w:t xml:space="preserve"> </w:t>
       </w:r>
-      <w:proofErr w:type="spellStart"/>
-      <w:r>
-        <w:t>Race</w:t>
-      </w:r>
-      <w:proofErr w:type="spellEnd"/>
-      <w:r>
-        <w:t xml:space="preserve"> </w:t>
-      </w:r>
-      <w:proofErr w:type="spellStart"/>
-      <w:r>
-        <w:t>Infinity</w:t>
-      </w:r>
-      <w:proofErr w:type="spellEnd"/>
+      <w:r>
+        <w:t>Race Infinity</w:t>
+      </w:r>
     </w:p>
     <w:p/>
     <w:p/>
@@ -221,23 +169,7 @@
     </w:p>
     <w:p>
       <w:r>
-        <w:t xml:space="preserve">Revisar los valores de velocidad máxima, aceleración… del car </w:t>
-      </w:r>
-      <w:proofErr w:type="spellStart"/>
-      <w:r>
-        <w:t>controller</w:t>
-      </w:r>
-      <w:proofErr w:type="spellEnd"/>
-      <w:r>
-        <w:t xml:space="preserve"> para optimizarlos de la </w:t>
-      </w:r>
-      <w:proofErr w:type="spellStart"/>
-      <w:r>
-        <w:t>ejor</w:t>
-      </w:r>
-      <w:proofErr w:type="spellEnd"/>
-      <w:r>
-        <w:t xml:space="preserve"> manera para el agente</w:t>
+        <w:t>Revisar los valores de velocidad máxima, aceleración… del car controller para optimizarlos de la ejor manera para el agente</w:t>
       </w:r>
     </w:p>
     <w:p/>
@@ -263,34 +195,39 @@
     </w:p>
     <w:p>
       <w:r>
-        <w:t xml:space="preserve">ahora ya </w:t>
-      </w:r>
-      <w:proofErr w:type="spellStart"/>
-      <w:r>
-        <w:t>esta</w:t>
-      </w:r>
-      <w:proofErr w:type="spellEnd"/>
-      <w:r>
-        <w:t xml:space="preserve"> el problema de </w:t>
-      </w:r>
-      <w:proofErr w:type="spellStart"/>
-      <w:r>
-        <w:t>proximos</w:t>
-      </w:r>
-      <w:proofErr w:type="spellEnd"/>
-      <w:r>
-        <w:t xml:space="preserve"> circuitos solucionados, ya se actualiza, pero para solucionar eso, se </w:t>
-      </w:r>
-      <w:proofErr w:type="spellStart"/>
-      <w:r>
-        <w:t>a</w:t>
-      </w:r>
-      <w:proofErr w:type="spellEnd"/>
-      <w:r>
-        <w:t xml:space="preserve"> fastidiado el del primer circuito ya que ahora aparece vueltas 1/0 y cuando se completa 1 vuelta se resetea el episodio creo. como lo soluciono ?</w:t>
+        <w:t>ahora ya esta el problema de proximos circuitos solucionados, ya se actualiza, pero para solucionar eso, se a fastidiado el del primer circuito ya que ahora aparece vueltas 1/0 y cuando se completa 1 vuelta se resetea el episodio creo. como lo soluciono ?</w:t>
       </w:r>
     </w:p>
     <w:p/>
+    <w:p/>
+    <w:p>
+      <w:r>
+        <w:t>cargar un circuito, instanciar 1 coche, y mover sl spawn nuevo cuandop se termina el episodio.</w:t>
+      </w:r>
+    </w:p>
+    <w:p/>
+    <w:p>
+      <w:r>
+        <w:t>Circuito desde el inicio con el agente y cambiar la posición cuando se instancia nuevo circuito.</w:t>
+      </w:r>
+    </w:p>
+    <w:p/>
+    <w:p/>
+    <w:p>
+      <w:r>
+        <w:t>Acciones discretas</w:t>
+      </w:r>
+    </w:p>
+    <w:p>
+      <w:pPr>
+        <w:rPr>
+          <w:u w:val="single"/>
+        </w:rPr>
+      </w:pPr>
+      <w:r>
+        <w:t>Copiar funciones heurísticas y move agente y modificar onactionsreceived</w:t>
+      </w:r>
+    </w:p>
     <w:p/>
     <w:p/>
     <w:p/>
@@ -907,6 +844,7 @@
   <w:style w:type="character" w:default="1" w:styleId="Fuentedeprrafopredeter">
     <w:name w:val="Default Paragraph Font"/>
     <w:uiPriority w:val="1"/>
+    <w:semiHidden/>
     <w:unhideWhenUsed/>
   </w:style>
   <w:style w:type="table" w:default="1" w:styleId="Tablanormal">

</xml_diff>

<commit_message>
actualizacion de cosas que hacer
</commit_message>
<xml_diff>
--- a/Cosas que hacer.docx
+++ b/Cosas que hacer.docx
@@ -1,6 +1,6 @@
 
 <file path=word/document.xml><?xml version="1.0" encoding="utf-8"?>
-<w:document xmlns:wpc="http://schemas.microsoft.com/office/word/2010/wordprocessingCanvas" xmlns:cx="http://schemas.microsoft.com/office/drawing/2014/chartex" xmlns:cx1="http://schemas.microsoft.com/office/drawing/2015/9/8/chartex" xmlns:cx2="http://schemas.microsoft.com/office/drawing/2015/10/21/chartex" xmlns:cx3="http://schemas.microsoft.com/office/drawing/2016/5/9/chartex" xmlns:cx4="http://schemas.microsoft.com/office/drawing/2016/5/10/chartex" xmlns:cx5="http://schemas.microsoft.com/office/drawing/2016/5/11/chartex" xmlns:cx6="http://schemas.microsoft.com/office/drawing/2016/5/12/chartex" xmlns:cx7="http://schemas.microsoft.com/office/drawing/2016/5/13/chartex" xmlns:cx8="http://schemas.microsoft.com/office/drawing/2016/5/14/chartex" xmlns:mc="http://schemas.openxmlformats.org/markup-compatibility/2006" xmlns:aink="http://schemas.microsoft.com/office/drawing/2016/ink" xmlns:am3d="http://schemas.microsoft.com/office/drawing/2017/model3d" xmlns:o="urn:schemas-microsoft-com:office:office" xmlns:oel="http://schemas.microsoft.com/office/2019/extlst" xmlns:r="http://schemas.openxmlformats.org/officeDocument/2006/relationships" xmlns:m="http://schemas.openxmlformats.org/officeDocument/2006/math" xmlns:v="urn:schemas-microsoft-com:vml" xmlns:wp14="http://schemas.microsoft.com/office/word/2010/wordprocessingDrawing" xmlns:wp="http://schemas.openxmlformats.org/drawingml/2006/wordprocessingDrawing" xmlns:w10="urn:schemas-microsoft-com:office:word" xmlns:w="http://schemas.openxmlformats.org/wordprocessingml/2006/main" xmlns:w14="http://schemas.microsoft.com/office/word/2010/wordml" xmlns:w15="http://schemas.microsoft.com/office/word/2012/wordml" xmlns:w16cex="http://schemas.microsoft.com/office/word/2018/wordml/cex" xmlns:w16cid="http://schemas.microsoft.com/office/word/2016/wordml/cid" xmlns:w16="http://schemas.microsoft.com/office/word/2018/wordml" xmlns:w16du="http://schemas.microsoft.com/office/word/2023/wordml/word16du" xmlns:w16sdtdh="http://schemas.microsoft.com/office/word/2020/wordml/sdtdatahash" xmlns:w16se="http://schemas.microsoft.com/office/word/2015/wordml/symex" xmlns:wpg="http://schemas.microsoft.com/office/word/2010/wordprocessingGroup" xmlns:wpi="http://schemas.microsoft.com/office/word/2010/wordprocessingInk" xmlns:wne="http://schemas.microsoft.com/office/word/2006/wordml" xmlns:wps="http://schemas.microsoft.com/office/word/2010/wordprocessingShape" mc:Ignorable="w14 w15 w16se w16cid w16 w16cex w16sdtdh w16du wp14">
+<w:document xmlns:wpc="http://schemas.microsoft.com/office/word/2010/wordprocessingCanvas" xmlns:cx="http://schemas.microsoft.com/office/drawing/2014/chartex" xmlns:cx1="http://schemas.microsoft.com/office/drawing/2015/9/8/chartex" xmlns:cx2="http://schemas.microsoft.com/office/drawing/2015/10/21/chartex" xmlns:cx3="http://schemas.microsoft.com/office/drawing/2016/5/9/chartex" xmlns:cx4="http://schemas.microsoft.com/office/drawing/2016/5/10/chartex" xmlns:cx5="http://schemas.microsoft.com/office/drawing/2016/5/11/chartex" xmlns:cx6="http://schemas.microsoft.com/office/drawing/2016/5/12/chartex" xmlns:cx7="http://schemas.microsoft.com/office/drawing/2016/5/13/chartex" xmlns:cx8="http://schemas.microsoft.com/office/drawing/2016/5/14/chartex" xmlns:mc="http://schemas.openxmlformats.org/markup-compatibility/2006" xmlns:aink="http://schemas.microsoft.com/office/drawing/2016/ink" xmlns:am3d="http://schemas.microsoft.com/office/drawing/2017/model3d" xmlns:o="urn:schemas-microsoft-com:office:office" xmlns:oel="http://schemas.microsoft.com/office/2019/extlst" xmlns:r="http://schemas.openxmlformats.org/officeDocument/2006/relationships" xmlns:m="http://schemas.openxmlformats.org/officeDocument/2006/math" xmlns:v="urn:schemas-microsoft-com:vml" xmlns:wp14="http://schemas.microsoft.com/office/word/2010/wordprocessingDrawing" xmlns:wp="http://schemas.openxmlformats.org/drawingml/2006/wordprocessingDrawing" xmlns:w10="urn:schemas-microsoft-com:office:word" xmlns:w="http://schemas.openxmlformats.org/wordprocessingml/2006/main" xmlns:w14="http://schemas.microsoft.com/office/word/2010/wordml" xmlns:w15="http://schemas.microsoft.com/office/word/2012/wordml" xmlns:w16cex="http://schemas.microsoft.com/office/word/2018/wordml/cex" xmlns:w16cid="http://schemas.microsoft.com/office/word/2016/wordml/cid" xmlns:w16="http://schemas.microsoft.com/office/word/2018/wordml" xmlns:w16du="http://schemas.microsoft.com/office/word/2023/wordml/word16du" xmlns:w16sdtdh="http://schemas.microsoft.com/office/word/2020/wordml/sdtdatahash" xmlns:w16sdtfl="http://schemas.microsoft.com/office/word/2024/wordml/sdtformatlock" xmlns:w16se="http://schemas.microsoft.com/office/word/2015/wordml/symex" xmlns:wpg="http://schemas.microsoft.com/office/word/2010/wordprocessingGroup" xmlns:wpi="http://schemas.microsoft.com/office/word/2010/wordprocessingInk" xmlns:wne="http://schemas.microsoft.com/office/word/2006/wordml" xmlns:wps="http://schemas.microsoft.com/office/word/2010/wordprocessingShape" mc:Ignorable="w14 w15 w16se w16cid w16 w16cex w16sdtdh w16sdtfl w16du wp14">
   <w:body>
     <w:p>
       <w:r>
@@ -200,6 +200,27 @@
         <w:t>Hacer videos, 4</w:t>
       </w:r>
     </w:p>
+    <w:p>
+      <w:r>
+        <w:t>Video de entrenando</w:t>
+      </w:r>
+    </w:p>
+    <w:p>
+      <w:r>
+        <w:t>Video de generando</w:t>
+      </w:r>
+    </w:p>
+    <w:p>
+      <w:r>
+        <w:t>Video de agente superando una vuelta solo</w:t>
+      </w:r>
+    </w:p>
+    <w:p>
+      <w:r>
+        <w:t>Video de 2 agentes corriendo juntos</w:t>
+      </w:r>
+    </w:p>
+    <w:p/>
     <w:p>
       <w:r>
         <w:t>Pantalla final de carrera.</w:t>
@@ -262,7 +283,7 @@
 </file>
 
 <file path=word/styles.xml><?xml version="1.0" encoding="utf-8"?>
-<w:styles xmlns:mc="http://schemas.openxmlformats.org/markup-compatibility/2006" xmlns:r="http://schemas.openxmlformats.org/officeDocument/2006/relationships" xmlns:w="http://schemas.openxmlformats.org/wordprocessingml/2006/main" xmlns:w14="http://schemas.microsoft.com/office/word/2010/wordml" xmlns:w15="http://schemas.microsoft.com/office/word/2012/wordml" xmlns:w16cex="http://schemas.microsoft.com/office/word/2018/wordml/cex" xmlns:w16cid="http://schemas.microsoft.com/office/word/2016/wordml/cid" xmlns:w16="http://schemas.microsoft.com/office/word/2018/wordml" xmlns:w16du="http://schemas.microsoft.com/office/word/2023/wordml/word16du" xmlns:w16sdtdh="http://schemas.microsoft.com/office/word/2020/wordml/sdtdatahash" xmlns:w16se="http://schemas.microsoft.com/office/word/2015/wordml/symex" mc:Ignorable="w14 w15 w16se w16cid w16 w16cex w16sdtdh w16du">
+<w:styles xmlns:mc="http://schemas.openxmlformats.org/markup-compatibility/2006" xmlns:r="http://schemas.openxmlformats.org/officeDocument/2006/relationships" xmlns:w="http://schemas.openxmlformats.org/wordprocessingml/2006/main" xmlns:w14="http://schemas.microsoft.com/office/word/2010/wordml" xmlns:w15="http://schemas.microsoft.com/office/word/2012/wordml" xmlns:w16cex="http://schemas.microsoft.com/office/word/2018/wordml/cex" xmlns:w16cid="http://schemas.microsoft.com/office/word/2016/wordml/cid" xmlns:w16="http://schemas.microsoft.com/office/word/2018/wordml" xmlns:w16du="http://schemas.microsoft.com/office/word/2023/wordml/word16du" xmlns:w16sdtdh="http://schemas.microsoft.com/office/word/2020/wordml/sdtdatahash" xmlns:w16sdtfl="http://schemas.microsoft.com/office/word/2024/wordml/sdtformatlock" xmlns:w16se="http://schemas.microsoft.com/office/word/2015/wordml/symex" mc:Ignorable="w14 w15 w16se w16cid w16 w16cex w16sdtdh w16sdtfl w16du">
   <w:docDefaults>
     <w:rPrDefault>
       <w:rPr>
@@ -864,7 +885,6 @@
   <w:style w:type="character" w:default="1" w:styleId="Fuentedeprrafopredeter">
     <w:name w:val="Default Paragraph Font"/>
     <w:uiPriority w:val="1"/>
-    <w:semiHidden/>
     <w:unhideWhenUsed/>
   </w:style>
   <w:style w:type="table" w:default="1" w:styleId="Tablanormal">

</xml_diff>